<commit_message>
update 412 to Helvetica and updated character counts for overflow fields
</commit_message>
<xml_diff>
--- a/docassemble/MLHDivorceAndCustody/data/templates/judgment_addendum_parenting_time.docx
+++ b/docassemble/MLHDivorceAndCustody/data/templates/judgment_addendum_parenting_time.docx
@@ -742,7 +742,29 @@
           <w:sz w:val="22"/>
           <w:szCs w:val="22"/>
         </w:rPr>
-        <w:t xml:space="preserve"> | length &gt; 240 %}</w:t>
+        <w:t xml:space="preserve"> | length &gt; </w:t>
+      </w:r>
+      <w:r>
+        <w:rPr>
+          <w:b w:val="0"/>
+          <w:bCs w:val="0"/>
+          <w:color w:val="231F20"/>
+          <w:spacing w:val="-10"/>
+          <w:sz w:val="22"/>
+          <w:szCs w:val="22"/>
+        </w:rPr>
+        <w:t>65</w:t>
+      </w:r>
+      <w:r>
+        <w:rPr>
+          <w:b w:val="0"/>
+          <w:bCs w:val="0"/>
+          <w:color w:val="231F20"/>
+          <w:spacing w:val="-10"/>
+          <w:sz w:val="22"/>
+          <w:szCs w:val="22"/>
+        </w:rPr>
+        <w:t>0 %}</w:t>
       </w:r>
     </w:p>
     <w:p>

</xml_diff>